<commit_message>
Update test1 fixture with blank-line cases
Adds blank-line gaps after the first/second lines (1 and 2 empty paragraphs) so
the sample exercises blank-line sentence/stanza boundaries.

Co-Authored-By: Claude Opus 4.8 <noreply@anthropic.com>
</commit_message>
<xml_diff>
--- a/tests/e2e/fixtures/test1.docx
+++ b/tests/e2e/fixtures/test1.docx
@@ -18,125 +18,135 @@
       </w:r>
     </w:p>
     <w:p>
-      <w:r>
-        <w:t>In fulva dum pulchra Venus spatiatur arena,</w:t>
-      </w:r>
-    </w:p>
-    <w:p>
-      <w:r>
-        <w:t>Et pelagi spectat maxima regna sui.</w:t>
-      </w:r>
-    </w:p>
-    <w:p>
-      <w:r>
-        <w:t>Venit Amor, sumpsitque facem; fax missa per auras</w:t>
-      </w:r>
-    </w:p>
-    <w:p>
-      <w:r>
-        <w:t>Ussit Acidaliae mollia corda deae.</w:t>
-      </w:r>
-    </w:p>
-    <w:p>
-      <w:r>
-        <w:t>Novit ut illa sui rutilantia spicula nati,</w:t>
-      </w:r>
-    </w:p>
-    <w:p>
-      <w:r>
-        <w:t>Vociferat, quid me nate proterve cremas?</w:t>
-      </w:r>
-    </w:p>
-    <w:p>
-      <w:r>
-        <w:t>Palluit audito matris clamore Cupido;</w:t>
-      </w:r>
-    </w:p>
-    <w:p>
-      <w:r>
-        <w:t>Palluit, utque silex obriguere comae.</w:t>
-      </w:r>
-    </w:p>
-    <w:p>
-      <w:r>
-        <w:t>Flens tandem dixit, non est tibi Caelia dispar;</w:t>
-      </w:r>
-    </w:p>
-    <w:p>
-      <w:r>
-        <w:t>Hanc volui, non te, parce, ferire deam.</w:t>
-      </w:r>
-    </w:p>
-    <w:p>
-      <w:pPr>
-        <w:rPr>
-          <w:b/>
-        </w:rPr>
-      </w:pPr>
-      <w:r>
-        <w:rPr>
-          <w:b/>
-        </w:rPr>
-        <w:t>De Caelia, et Amore</w:t>
-      </w:r>
-    </w:p>
-    <w:p>
-      <w:r>
-        <w:t>Caelia fatur; Amor fatur: sua lumina pandit</w:t>
-      </w:r>
-    </w:p>
-    <w:p>
-      <w:r>
-        <w:t>Caelia, purpureus lumina pandit Amor.</w:t>
-      </w:r>
-    </w:p>
-    <w:p>
-      <w:r>
-        <w:t>Caelia dormit, Amor dormit. Stat Caelia sola,</w:t>
-      </w:r>
-    </w:p>
-    <w:p>
-      <w:r>
-        <w:t>Solus Amor. ridet Caelia, ridet Amor.</w:t>
-      </w:r>
-    </w:p>
-    <w:p>
-      <w:r>
-        <w:t>Caelia plaudit, Amor plaudit. dat Caelia cantus,</w:t>
-      </w:r>
-    </w:p>
-    <w:p>
-      <w:r>
-        <w:t>Cantat Amor. plorat Caelia, plorat Amor.</w:t>
-      </w:r>
-    </w:p>
-    <w:p>
-      <w:r>
-        <w:t>Caelia plectra manu tractat, sua plectra decorus</w:t>
-      </w:r>
-    </w:p>
-    <w:p>
-      <w:r>
-        <w:t>Tractat Amor. vadit Caelia, vadit Amor.</w:t>
-      </w:r>
-    </w:p>
-    <w:p>
-      <w:r>
-        <w:t>Quodcumque illa facit, facit hic. tamen ordine in uno</w:t>
-      </w:r>
-    </w:p>
-    <w:p>
-      <w:r>
-        <w:t>Hoc variant; saeva est Caelia, mitis Amor.</w:t>
-      </w:r>
-    </w:p>
-    <w:p>
       <w:pPr>
         <w:rPr>
           <w:b/>
           <w:bCs/>
         </w:rPr>
       </w:pPr>
+    </w:p>
+    <w:p>
+      <w:r>
+        <w:t>In fulva dum pulchra Venus spatiatur arena,</w:t>
+      </w:r>
+    </w:p>
+    <w:p/>
+    <w:p/>
+    <w:p>
+      <w:r>
+        <w:t>Et pelagi spectat maxima regna sui.</w:t>
+      </w:r>
+    </w:p>
+    <w:p>
+      <w:r>
+        <w:t>Venit Amor, sumpsitque facem; fax missa per auras</w:t>
+      </w:r>
+    </w:p>
+    <w:p>
+      <w:r>
+        <w:t>Ussit Acidaliae mollia corda deae.</w:t>
+      </w:r>
+    </w:p>
+    <w:p>
+      <w:r>
+        <w:t>Novit ut illa sui rutilantia spicula nati,</w:t>
+      </w:r>
+    </w:p>
+    <w:p>
+      <w:r>
+        <w:t>Vociferat, quid me nate proterve cremas?</w:t>
+      </w:r>
+    </w:p>
+    <w:p>
+      <w:r>
+        <w:t>Palluit audito matris clamore Cupido;</w:t>
+      </w:r>
+    </w:p>
+    <w:p>
+      <w:r>
+        <w:t>Palluit, utque silex obriguere comae.</w:t>
+      </w:r>
+    </w:p>
+    <w:p>
+      <w:r>
+        <w:t>Flens tandem dixit, non est tibi Caelia dispar;</w:t>
+      </w:r>
+    </w:p>
+    <w:p>
+      <w:r>
+        <w:t>Hanc volui, non te, parce, ferire deam.</w:t>
+      </w:r>
+    </w:p>
+    <w:p>
+      <w:pPr>
+        <w:rPr>
+          <w:b/>
+        </w:rPr>
+      </w:pPr>
+      <w:r>
+        <w:rPr>
+          <w:b/>
+        </w:rPr>
+        <w:t>De Caelia, et Amore</w:t>
+      </w:r>
+    </w:p>
+    <w:p>
+      <w:r>
+        <w:t>Caelia fatur; Amor fatur: sua lumina pandit</w:t>
+      </w:r>
+    </w:p>
+    <w:p>
+      <w:r>
+        <w:t>Caelia, purpureus lumina pandit Amor.</w:t>
+      </w:r>
+    </w:p>
+    <w:p>
+      <w:r>
+        <w:t>Caelia dormit, Amor dormit. Stat Caelia sola,</w:t>
+      </w:r>
+    </w:p>
+    <w:p>
+      <w:r>
+        <w:t>Solus Amor. ridet Caelia, ridet Amor.</w:t>
+      </w:r>
+    </w:p>
+    <w:p>
+      <w:r>
+        <w:t>Caelia plaudit, Amor plaudit. dat Caelia cantus,</w:t>
+      </w:r>
+    </w:p>
+    <w:p>
+      <w:r>
+        <w:t>Cantat Amor. plorat Caelia, plorat Amor.</w:t>
+      </w:r>
+    </w:p>
+    <w:p>
+      <w:r>
+        <w:t>Caelia plectra manu tractat, sua plectra decorus</w:t>
+      </w:r>
+    </w:p>
+    <w:p>
+      <w:r>
+        <w:t>Tractat Amor. vadit Caelia, vadit Amor.</w:t>
+      </w:r>
+    </w:p>
+    <w:p>
+      <w:r>
+        <w:t>Quodcumque illa facit, facit hic. tamen ordine in uno</w:t>
+      </w:r>
+    </w:p>
+    <w:p>
+      <w:r>
+        <w:t>Hoc variant; saeva est Caelia, mitis Amor.</w:t>
+      </w:r>
+    </w:p>
+    <w:p>
+      <w:pPr>
+        <w:rPr>
+          <w:b/>
+          <w:bCs/>
+        </w:rPr>
+      </w:pPr>
       <w:r>
         <w:rPr>
           <w:b/>
@@ -172,6 +182,7 @@
     </w:p>
     <w:p>
       <w:r>
+        <w:lastRenderedPageBreak/>
         <w:t>Non tibi, tu saeva cuspide regna tenes.</w:t>
       </w:r>
     </w:p>
@@ -187,7 +198,6 @@
     </w:p>
     <w:p>
       <w:r>
-        <w:lastRenderedPageBreak/>
         <w:t>Haec simul ut fudi trepidanti pectore verba,</w:t>
       </w:r>
     </w:p>

</xml_diff>